<commit_message>
gergacs-marketing: USPAP residue cleanup + gitignore
Final compliance pass found two residual non-compliant phrases in
production planning copy (not customer-facing but still a leak):

- lane_1_sales/30_day_calendar.md line 105 "what your home is worth"
  angle → "what the comparables show" angle
- competitive_landscape.md "defensible price intelligence" →
  "comparable-supported pricing analysis grounded in 21 years of
  appraisal methodology"

Re-converted both MDs to PDF + DOCX. All 5 banned phrases now show
0 production hits in the USPAP rescan. (Phrases still appear inside
the rules-bearing files — uspap_compliance, voice_matrix, agent skills
— where they're correctly listed as banned examples.)

Also added .gitignore to exclude Python __pycache__/ artifacts.

Co-Authored-By: Claude Opus 4.7 (1M context) <noreply@anthropic.com>
</commit_message>
<xml_diff>
--- a/gergacs-marketing-system/09_office_formats/docx/02_campaigns/lane_1_sales/30_day_calendar.docx
+++ b/gergacs-marketing-system/09_office_formats/docx/02_campaigns/lane_1_sales/30_day_calendar.docx
@@ -1308,13 +1308,13 @@
               <w:pStyle w:val="Compact"/>
             </w:pPr>
             <w:r>
-              <w:t xml:space="preserve">Build variant 2 of Ad #1 (Pre-List Valuation): more direct</w:t>
+              <w:t xml:space="preserve">Build variant 2 of Ad #1 (Pre-List Comparable Analysis): more direct</w:t>
             </w:r>
             <w:r>
               <w:t xml:space="preserve"> </w:t>
             </w:r>
             <w:r>
-              <w:t xml:space="preserve">“what your home is worth”</w:t>
+              <w:t xml:space="preserve">“what the comparables show”</w:t>
             </w:r>
             <w:r>
               <w:t xml:space="preserve"> </w:t>

</xml_diff>